<commit_message>
Rewrite the M&M manuscript for microscopists: glossary, step-by-step method, failure images; correct the v1 crash, FOV grouping and zoom-count confound
</commit_message>
<xml_diff>
--- a/paper/mam/cover_letter.docx
+++ b/paper/mam/cover_letter.docx
@@ -16,7 +16,7 @@
         <w:pStyle w:val="FirstParagraph"/>
       </w:pPr>
       <w:r>
-        <w:t xml:space="preserve">Dear Editors,</w:t>
+        <w:t xml:space="preserve">Dear Dr. Michael,</w:t>
       </w:r>
     </w:p>
     <w:p>
@@ -61,7 +61,43 @@
         <w:pStyle w:val="BodyText"/>
       </w:pPr>
       <w:r>
-        <w:t xml:space="preserve">Correlative workflows increasingly depend on registering images from instruments that share almost no visual appearance and can differ in field of view by more than an order of magnitude. Pretrained dense image matchers are now the strongest available tool for that step, and the obvious way to extend them to a large field-of-view gap is to tile the wider image, match each tile, pool the correspondences and fit one transform. It needs no training and treats the matcher as a black box. We expected it to work; it was the central hypothesis of the project.</w:t>
+        <w:t xml:space="preserve">This is a rewritten version of manuscript MAM-26-246, which you declined on 11 September 2026. Your comment was that the manuscript</w:t>
+      </w:r>
+      <w:r>
+        <w:t xml:space="preserve"> </w:t>
+      </w:r>
+      <w:r>
+        <w:t xml:space="preserve">“may contain important new information for the microscopy community”</w:t>
+      </w:r>
+      <w:r>
+        <w:t xml:space="preserve"> </w:t>
+      </w:r>
+      <w:r>
+        <w:t xml:space="preserve">but was</w:t>
+      </w:r>
+      <w:r>
+        <w:t xml:space="preserve"> </w:t>
+      </w:r>
+      <w:r>
+        <w:t xml:space="preserve">“extremely difficult to read,”</w:t>
+      </w:r>
+      <w:r>
+        <w:t xml:space="preserve"> </w:t>
+      </w:r>
+      <w:r>
+        <w:t xml:space="preserve">and you suggested that it</w:t>
+      </w:r>
+      <w:r>
+        <w:t xml:space="preserve"> </w:t>
+      </w:r>
+      <w:r>
+        <w:t xml:space="preserve">“be written in a more tutorial way so that terms and methods are better described and examples of the failures are shown.”</w:t>
+      </w:r>
+      <w:r>
+        <w:t xml:space="preserve"> </w:t>
+      </w:r>
+      <w:r>
+        <w:t xml:space="preserve">I agreed with that assessment. The earlier text had been condensed from a version written for a machine-learning venue, and it assumed a reader who already knew the methods. I have rewritten the paper from the beginning for a microscopist reader, and I want to be open that this is the same study.</w:t>
       </w:r>
     </w:p>
     <w:p>
@@ -69,7 +105,17 @@
         <w:pStyle w:val="BodyText"/>
       </w:pPr>
       <w:r>
-        <w:t xml:space="preserve">It does not work, and the manuscript’s main contribution is the reason. Dense matchers never decline to match. A tile that does not overlap the target at all still returns its full complement of confident correspondences, so pooling floods robust estimation: across the 187 pairs of the public AmalgaMatch benchmark the median inlier fraction falls from 0.114 to 0.005, and median error rises from 80 to 2708 pixels. The argument makes no reference to tile size, overlap or backbone, so it predicts failure for any pool-then-fit tiling scheme built on a matcher of this class. We think this is worth reporting precisely because the approach is so natural — it is the first thing a practitioner will try, and the failure is silent, producing a confident transform rather than an error.</w:t>
+        <w:rPr>
+          <w:b/>
+          <w:bCs/>
+        </w:rPr>
+        <w:t xml:space="preserve">Terms.</w:t>
+      </w:r>
+      <w:r>
+        <w:t xml:space="preserve"> </w:t>
+      </w:r>
+      <w:r>
+        <w:t xml:space="preserve">Every technical term is now defined in plain language where it first matters, and Table 1 collects them in one place. Abbreviations are kept to the standard microscopy ones.</w:t>
       </w:r>
     </w:p>
     <w:p>
@@ -77,7 +123,17 @@
         <w:pStyle w:val="BodyText"/>
       </w:pPr>
       <w:r>
-        <w:t xml:space="preserve">We then report what does and does not repair it. A verified coarse-to-fine wrapper, which admits a candidate transform only when a mutual-information verifier beats the incumbent, removes the collapse entirely but buys nothing in aggregate on this benchmark. On a controlled ladder that crops real pairs to shrinking field of view with appearance, modality and pixel size held fixed, the same wrapper triples success at 10 % field of view. The benchmark simply never presents scale as an isolated failure mode: we measure the appearance axis directly and show that its low-field-of-view pairs are also its most appearance-divergent, and that below an area ratio of 0.5 the benchmark carries too little leverage to rank the two constraints against each other. We state that as a finding about the benchmark, and we withdraw an earlier claim of ours that was not entitled to it.</w:t>
+        <w:rPr>
+          <w:b/>
+          <w:bCs/>
+        </w:rPr>
+        <w:t xml:space="preserve">Methods.</w:t>
+      </w:r>
+      <w:r>
+        <w:t xml:space="preserve"> </w:t>
+      </w:r>
+      <w:r>
+        <w:t xml:space="preserve">Section 2.4 walks through the registration of one real pair step by step (Figure 2): what the matching network returns, how robust fitting keeps some correspondences and rejects others, how the fitted transformation places the narrow image, and how the error is measured. Both tiling schemes are described as numbered steps, and a new paragraph explains the ceiling that the hand-annotated points themselves set on any method.</w:t>
       </w:r>
     </w:p>
     <w:p>
@@ -85,7 +141,17 @@
         <w:pStyle w:val="BodyText"/>
       </w:pPr>
       <w:r>
-        <w:t xml:space="preserve">One further result may interest the journal’s methodological readership beyond this particular application. Our pipeline offers an optional thin-plate-spline refinement stage, and refinement coverage varies from 0/187 to 187/187 across the configurations we compare. Scoring the identical experiments after that stage converts both of our null aggregate results into significant ones. A refined table is therefore not one metric but two, interleaved by configuration. We headline the unrefined error because it scores every configuration identically, we report both throughout, and we note that the change removes statistical significance from two of our own results rather than creating it. The recommendation we draw is cheap and general: report post-processing coverage per configuration, and check headline contrasts with the optional stage disabled.</w:t>
+        <w:rPr>
+          <w:b/>
+          <w:bCs/>
+        </w:rPr>
+        <w:t xml:space="preserve">Examples of the failures.</w:t>
+      </w:r>
+      <w:r>
+        <w:t xml:space="preserve"> </w:t>
+      </w:r>
+      <w:r>
+        <w:t xml:space="preserve">The earlier version reported failures only as rates. The rewrite shows them as images of real benchmark pairs. Figure 1 shows the problem itself. Figure 3 shows the mechanism of the main negative result on one pair: a tile containing none of the narrow image still yields 10,000 correspondences, which are pooled with the rest. Figure 4 shows three kinds of failure: a pair that looks different in the two images, a pair with a very small field of view, and a pair that a fine-tuned network forgets how to register. Section 4.1 then turns the results into practical guidance for someone registering their own images.</w:t>
       </w:r>
     </w:p>
     <w:p>
@@ -93,31 +159,89 @@
         <w:pStyle w:val="BodyText"/>
       </w:pPr>
       <w:r>
-        <w:t xml:space="preserve">The manuscript is a diagnostic study, and several of its central results are negative. We have tried to report them at the strength the evidence supports and no higher, including in the three places where it cost us a claim we previously made.</w:t>
+        <w:rPr>
+          <w:b/>
+          <w:bCs/>
+        </w:rPr>
+        <w:t xml:space="preserve">Corrections.</w:t>
+      </w:r>
+      <w:r>
+        <w:t xml:space="preserve"> </w:t>
+      </w:r>
+      <w:r>
+        <w:t xml:space="preserve">While preparing these examples I rechecked every number against the per-pair result files, and found three errors in the earlier version that I want to disclose.</w:t>
       </w:r>
     </w:p>
     <w:p>
       <w:pPr>
-        <w:pStyle w:val="BodyText"/>
-      </w:pPr>
-      <w:r>
-        <w:t xml:space="preserve">The evaluation harness, wrapper implementations, ladder construction, fine-tuning trainer and every analysis script are openly released, and all tables and figures regenerate from the released per-pair result files. The two exceptions are stated explicitly in the Data Availability statement.</w:t>
+        <w:pStyle w:val="Compact"/>
+        <w:numPr>
+          <w:ilvl w:val="0"/>
+          <w:numId w:val="1001"/>
+        </w:numPr>
+      </w:pPr>
+      <w:r>
+        <w:t xml:space="preserve">The earlier text said that pooled tiling produced</w:t>
+      </w:r>
+      <w:r>
+        <w:t xml:space="preserve"> </w:t>
+      </w:r>
+      <w:r>
+        <w:t xml:space="preserve">“hard failures”</w:t>
+      </w:r>
+      <w:r>
+        <w:t xml:space="preserve"> </w:t>
+      </w:r>
+      <w:r>
+        <w:t xml:space="preserve">on 106 of the 187 pairs. In fact, the computation for those 106 pairs stopped because of a fault on the graphics processor, so the method was never evaluated on them. The rewrite reports pooled tiling on the 81 pairs where it did run, compared with direct matching on the same pairs. It also separates the 33 pairs that were genuinely tiled from 48 on which the implementation padded the image instead of tiling it (Section 2.6, Table 4, Supplementary Section S1).</w:t>
       </w:r>
     </w:p>
     <w:p>
       <w:pPr>
-        <w:pStyle w:val="BodyText"/>
-      </w:pPr>
-      <w:r>
-        <w:t xml:space="preserve">This work is original, is not under consideration elsewhere, and has not been published previously. The author declares no conflict of interest and has no financial interest in any of the software evaluated.</w:t>
+        <w:pStyle w:val="Compact"/>
+        <w:numPr>
+          <w:ilvl w:val="0"/>
+          <w:numId w:val="1001"/>
+        </w:numPr>
+      </w:pPr>
+      <w:r>
+        <w:t xml:space="preserve">The field-of-view groups had been computed from the benchmark’s pixel-size metadata, although the text described them as derived from the annotated points. For 13 pairs the metadata disagrees with the annotated points. The groups are now computed from the annotated points, and the disagreement is documented (Section 2.2, Supplementary Section S2).</w:t>
       </w:r>
     </w:p>
     <w:p>
       <w:pPr>
+        <w:pStyle w:val="Compact"/>
+        <w:numPr>
+          <w:ilvl w:val="0"/>
+          <w:numId w:val="1001"/>
+        </w:numPr>
+      </w:pPr>
+      <w:r>
+        <w:t xml:space="preserve">One comparison of the coarse-to-fine search mixed two settings, and the rewrite states which setting each run used (Section 2.7, Supplementary Section S4).</w:t>
+      </w:r>
+    </w:p>
+    <w:p>
+      <w:pPr>
+        <w:pStyle w:val="FirstParagraph"/>
+      </w:pPr>
+      <w:r>
+        <w:t xml:space="preserve">None of these changes the conclusions. On the genuinely tiled pairs, pooled tiling raised the median error from 68 to 538 pixels. The checked coarse-to-fine search still gains nothing on the real pairs and still triples success when field of view is the only difficulty. Every number in the rewrite is now recomputed from the released result files by a script, and a separate check confirms that the text matches it.</w:t>
+      </w:r>
+    </w:p>
+    <w:p>
+      <w:pPr>
         <w:pStyle w:val="BodyText"/>
       </w:pPr>
       <w:r>
-        <w:t xml:space="preserve">Thank you for your consideration.</w:t>
+        <w:t xml:space="preserve">This work has not been published and is not under consideration elsewhere. The author declares no competing interests. The code, the per-pair result files and every analysis script are openly available, and the benchmark itself is public. The use of an artificial-intelligence assistant is described in Section 2.14.</w:t>
+      </w:r>
+    </w:p>
+    <w:p>
+      <w:pPr>
+        <w:pStyle w:val="BodyText"/>
+      </w:pPr>
+      <w:r>
+        <w:t xml:space="preserve">Thank you for your comment on the earlier version, and for considering this one.</w:t>
       </w:r>
     </w:p>
     <w:p>
@@ -157,6 +281,8 @@
       <w:footnotePr>
         <w:numRestart w:val="eachSect"/>
       </w:footnotePr>
+      <w:pgSz w:w="12240" w:h="15840"/>
+      <w:pgMar w:top="1440" w:right="1440" w:bottom="1440" w:left="1440" w:header="720" w:footer="720" w:gutter="0"/>
     </w:sectPr>
   </w:body>
 </w:document>
@@ -263,8 +389,123 @@
       </w:pPr>
     </w:lvl>
   </w:abstractNum>
+  <w:abstractNum w:abstractNumId="99411">
+    <w:nsid w:val="00A99411"/>
+    <w:multiLevelType w:val="multilevel"/>
+    <w:lvl w:ilvl="0">
+      <w:start w:val="1"/>
+      <w:numFmt w:val="decimal"/>
+      <w:lvlText w:val="%1."/>
+      <w:lvlJc w:val="left"/>
+      <w:pPr>
+        <w:ind w:left="720" w:hanging="360"/>
+      </w:pPr>
+    </w:lvl>
+    <w:lvl w:ilvl="1">
+      <w:start w:val="1"/>
+      <w:numFmt w:val="decimal"/>
+      <w:lvlText w:val="%2."/>
+      <w:lvlJc w:val="left"/>
+      <w:pPr>
+        <w:ind w:left="1440" w:hanging="360"/>
+      </w:pPr>
+    </w:lvl>
+    <w:lvl w:ilvl="2">
+      <w:start w:val="1"/>
+      <w:numFmt w:val="decimal"/>
+      <w:lvlText w:val="%3."/>
+      <w:lvlJc w:val="left"/>
+      <w:pPr>
+        <w:ind w:left="2160" w:hanging="360"/>
+      </w:pPr>
+    </w:lvl>
+    <w:lvl w:ilvl="3">
+      <w:start w:val="1"/>
+      <w:numFmt w:val="decimal"/>
+      <w:lvlText w:val="%4."/>
+      <w:lvlJc w:val="left"/>
+      <w:pPr>
+        <w:ind w:left="2880" w:hanging="360"/>
+      </w:pPr>
+    </w:lvl>
+    <w:lvl w:ilvl="4">
+      <w:start w:val="1"/>
+      <w:numFmt w:val="decimal"/>
+      <w:lvlText w:val="%5."/>
+      <w:lvlJc w:val="left"/>
+      <w:pPr>
+        <w:ind w:left="3600" w:hanging="360"/>
+      </w:pPr>
+    </w:lvl>
+    <w:lvl w:ilvl="5">
+      <w:start w:val="1"/>
+      <w:numFmt w:val="decimal"/>
+      <w:lvlText w:val="%6."/>
+      <w:lvlJc w:val="left"/>
+      <w:pPr>
+        <w:ind w:left="4320" w:hanging="360"/>
+      </w:pPr>
+    </w:lvl>
+    <w:lvl w:ilvl="6">
+      <w:start w:val="1"/>
+      <w:numFmt w:val="decimal"/>
+      <w:lvlText w:val="%7."/>
+      <w:lvlJc w:val="left"/>
+      <w:pPr>
+        <w:ind w:left="5040" w:hanging="360"/>
+      </w:pPr>
+    </w:lvl>
+    <w:lvl w:ilvl="7">
+      <w:start w:val="1"/>
+      <w:numFmt w:val="decimal"/>
+      <w:lvlText w:val="%8."/>
+      <w:lvlJc w:val="left"/>
+      <w:pPr>
+        <w:ind w:left="5760" w:hanging="360"/>
+      </w:pPr>
+    </w:lvl>
+    <w:lvl w:ilvl="8">
+      <w:start w:val="1"/>
+      <w:numFmt w:val="decimal"/>
+      <w:lvlText w:val="%9."/>
+      <w:lvlJc w:val="left"/>
+      <w:pPr>
+        <w:ind w:left="6480" w:hanging="360"/>
+      </w:pPr>
+    </w:lvl>
+  </w:abstractNum>
   <w:num w:numId="1000">
     <w:abstractNumId w:val="990"/>
+  </w:num>
+  <w:num w:numId="1001">
+    <w:abstractNumId w:val="99411"/>
+    <w:lvlOverride w:ilvl="0">
+      <w:startOverride w:val="1"/>
+    </w:lvlOverride>
+    <w:lvlOverride w:ilvl="1">
+      <w:startOverride w:val="1"/>
+    </w:lvlOverride>
+    <w:lvlOverride w:ilvl="2">
+      <w:startOverride w:val="1"/>
+    </w:lvlOverride>
+    <w:lvlOverride w:ilvl="3">
+      <w:startOverride w:val="1"/>
+    </w:lvlOverride>
+    <w:lvlOverride w:ilvl="4">
+      <w:startOverride w:val="1"/>
+    </w:lvlOverride>
+    <w:lvlOverride w:ilvl="5">
+      <w:startOverride w:val="1"/>
+    </w:lvlOverride>
+    <w:lvlOverride w:ilvl="6">
+      <w:startOverride w:val="1"/>
+    </w:lvlOverride>
+    <w:lvlOverride w:ilvl="7">
+      <w:startOverride w:val="1"/>
+    </w:lvlOverride>
+    <w:lvlOverride w:ilvl="8">
+      <w:startOverride w:val="1"/>
+    </w:lvlOverride>
   </w:num>
 </w:numbering>
 </file>
@@ -274,7 +515,7 @@
   <w:docDefaults>
     <w:rPrDefault>
       <w:rPr>
-        <w:rFonts w:asciiTheme="minorHAnsi" w:cstheme="minorBidi" w:eastAsiaTheme="minorEastAsia" w:hAnsiTheme="minorHAnsi"/>
+        <w:rFonts w:cstheme="minorBidi"/>
         <w:sz w:val="24"/>
         <w:szCs w:val="24"/>
         <w:lang w:bidi="ar-SA" w:eastAsia="zh-CN" w:val="en-US"/>
@@ -282,7 +523,7 @@
     </w:rPrDefault>
     <w:pPrDefault>
       <w:pPr>
-        <w:spacing w:after="200"/>
+        <w:spacing w:after="200" w:line="240" w:lineRule="auto"/>
       </w:pPr>
     </w:pPrDefault>
   </w:docDefaults>
@@ -290,6 +531,14 @@
   <w:style w:default="1" w:styleId="Normal" w:type="paragraph">
     <w:name w:val="Normal"/>
     <w:qFormat/>
+    <w:pPr>
+      <w:spacing w:before="0" w:after="0" w:line="240" w:lineRule="auto"/>
+    </w:pPr>
+    <w:rPr>
+      <w:rFonts w:ascii="Times New Roman" w:hAnsi="Times New Roman" w:cs="Times New Roman"/>
+      <w:sz w:val="24"/>
+      <w:szCs w:val="24"/>
+    </w:rPr>
   </w:style>
   <w:style w:styleId="BodyText" w:type="paragraph">
     <w:name w:val="Body Text"/>
@@ -297,7 +546,7 @@
     <w:link w:val="BodyTextChar"/>
     <w:qFormat/>
     <w:pPr>
-      <w:spacing w:after="180" w:before="180"/>
+      <w:spacing w:after="180" w:before="180" w:line="240" w:lineRule="auto"/>
     </w:pPr>
   </w:style>
   <w:style w:customStyle="1" w:styleId="FirstParagraph" w:type="paragraph">
@@ -311,7 +560,7 @@
     <w:basedOn w:val="BodyText"/>
     <w:qFormat/>
     <w:pPr>
-      <w:spacing w:after="36" w:before="36"/>
+      <w:spacing w:after="36" w:before="36" w:line="240" w:lineRule="auto"/>
     </w:pPr>
   </w:style>
   <w:style w:styleId="Title" w:type="paragraph">
@@ -328,7 +577,7 @@
       <w:jc w:val="center"/>
     </w:pPr>
     <w:rPr>
-      <w:rFonts w:asciiTheme="majorHAnsi" w:cstheme="majorBidi" w:eastAsiaTheme="majorEastAsia" w:hAnsiTheme="majorHAnsi"/>
+      <w:rFonts w:cstheme="majorBidi"/>
       <w:sz w:val="56"/>
       <w:szCs w:val="56"/>
     </w:rPr>
@@ -340,7 +589,7 @@
     <w:uiPriority w:val="10"/>
     <w:rsid w:val="00A10FD9"/>
     <w:rPr>
-      <w:rFonts w:asciiTheme="majorHAnsi" w:cstheme="majorBidi" w:eastAsiaTheme="majorEastAsia" w:hAnsiTheme="majorHAnsi"/>
+      <w:rFonts w:cstheme="majorBidi"/>
       <w:sz w:val="56"/>
       <w:szCs w:val="56"/>
     </w:rPr>
@@ -359,8 +608,8 @@
       </w:numPr>
     </w:pPr>
     <w:rPr>
-      <w:rFonts w:cstheme="majorBidi" w:eastAsiaTheme="majorEastAsia"/>
-      <w:spacing w:val="15"/>
+      <w:rFonts w:cstheme="majorBidi"/>
+      <w:spacing w:val="15" w:line="240" w:lineRule="auto"/>
       <w:sz w:val="28"/>
       <w:szCs w:val="28"/>
     </w:rPr>
@@ -372,9 +621,9 @@
     <w:uiPriority w:val="11"/>
     <w:rsid w:val="00A10FD9"/>
     <w:rPr>
-      <w:rFonts w:cstheme="majorBidi" w:eastAsiaTheme="majorEastAsia"/>
+      <w:rFonts w:cstheme="majorBidi"/>
       <w:color w:themeColor="text1" w:themeTint="A6" w:val="595959"/>
-      <w:spacing w:val="15"/>
+      <w:spacing w:val="15" w:line="240" w:lineRule="auto"/>
       <w:sz w:val="28"/>
       <w:szCs w:val="28"/>
     </w:rPr>
@@ -415,7 +664,7 @@
     <w:pPr>
       <w:keepNext/>
       <w:keepLines/>
-      <w:spacing w:after="0" w:before="300"/>
+      <w:spacing w:after="0" w:before="300" w:line="240" w:lineRule="auto"/>
       <w:jc w:val="center"/>
     </w:pPr>
     <w:rPr>
@@ -432,7 +681,7 @@
     <w:pPr>
       <w:keepNext/>
       <w:keepLines/>
-      <w:spacing w:after="300" w:before="100"/>
+      <w:spacing w:after="300" w:before="100" w:line="240" w:lineRule="auto"/>
     </w:pPr>
     <w:rPr>
       <w:sz w:val="20"/>
@@ -458,11 +707,11 @@
     <w:pPr>
       <w:keepNext/>
       <w:keepLines/>
-      <w:spacing w:after="80" w:before="360"/>
+      <w:spacing w:after="80" w:before="360" w:line="240" w:lineRule="auto"/>
       <w:outlineLvl w:val="0"/>
     </w:pPr>
     <w:rPr>
-      <w:rFonts w:asciiTheme="majorHAnsi" w:cstheme="majorBidi" w:eastAsiaTheme="majorEastAsia" w:hAnsiTheme="majorHAnsi"/>
+      <w:rFonts w:cstheme="majorBidi"/>
       <w:color w:themeColor="accent1" w:themeShade="BF" w:val="0F4761"/>
       <w:sz w:val="40"/>
       <w:szCs w:val="40"/>
@@ -481,11 +730,11 @@
     <w:pPr>
       <w:keepNext/>
       <w:keepLines/>
-      <w:spacing w:after="80" w:before="160"/>
+      <w:spacing w:after="80" w:before="160" w:line="240" w:lineRule="auto"/>
       <w:outlineLvl w:val="1"/>
     </w:pPr>
     <w:rPr>
-      <w:rFonts w:asciiTheme="majorHAnsi" w:cstheme="majorBidi" w:eastAsiaTheme="majorEastAsia" w:hAnsiTheme="majorHAnsi"/>
+      <w:rFonts w:cstheme="majorBidi"/>
       <w:color w:themeColor="accent1" w:themeShade="BF" w:val="0F4761"/>
       <w:sz w:val="32"/>
       <w:szCs w:val="32"/>
@@ -504,11 +753,11 @@
     <w:pPr>
       <w:keepNext/>
       <w:keepLines/>
-      <w:spacing w:after="80" w:before="160"/>
+      <w:spacing w:after="80" w:before="160" w:line="240" w:lineRule="auto"/>
       <w:outlineLvl w:val="2"/>
     </w:pPr>
     <w:rPr>
-      <w:rFonts w:cstheme="majorBidi" w:eastAsiaTheme="majorEastAsia"/>
+      <w:rFonts w:cstheme="majorBidi"/>
       <w:color w:themeColor="accent1" w:themeShade="BF" w:val="0F4761"/>
       <w:sz w:val="28"/>
       <w:szCs w:val="28"/>
@@ -527,11 +776,11 @@
     <w:pPr>
       <w:keepNext/>
       <w:keepLines/>
-      <w:spacing w:after="40" w:before="80"/>
+      <w:spacing w:after="40" w:before="80" w:line="240" w:lineRule="auto"/>
       <w:outlineLvl w:val="3"/>
     </w:pPr>
     <w:rPr>
-      <w:rFonts w:cstheme="majorBidi" w:eastAsiaTheme="majorEastAsia"/>
+      <w:rFonts w:cstheme="majorBidi"/>
       <w:i/>
       <w:iCs/>
       <w:color w:themeColor="accent1" w:themeShade="BF" w:val="0F4761"/>
@@ -550,11 +799,11 @@
     <w:pPr>
       <w:keepNext/>
       <w:keepLines/>
-      <w:spacing w:after="40" w:before="80"/>
+      <w:spacing w:after="40" w:before="80" w:line="240" w:lineRule="auto"/>
       <w:outlineLvl w:val="4"/>
     </w:pPr>
     <w:rPr>
-      <w:rFonts w:cstheme="majorBidi" w:eastAsiaTheme="majorEastAsia"/>
+      <w:rFonts w:cstheme="majorBidi"/>
       <w:color w:themeColor="accent1" w:themeShade="BF" w:val="0F4761"/>
     </w:rPr>
   </w:style>
@@ -571,11 +820,11 @@
     <w:pPr>
       <w:keepNext/>
       <w:keepLines/>
-      <w:spacing w:after="0" w:before="40"/>
+      <w:spacing w:after="0" w:before="40" w:line="240" w:lineRule="auto"/>
       <w:outlineLvl w:val="5"/>
     </w:pPr>
     <w:rPr>
-      <w:rFonts w:cstheme="majorBidi" w:eastAsiaTheme="majorEastAsia"/>
+      <w:rFonts w:cstheme="majorBidi"/>
       <w:i/>
       <w:iCs/>
       <w:color w:themeColor="text1" w:themeTint="A6" w:val="595959"/>
@@ -594,11 +843,11 @@
     <w:pPr>
       <w:keepNext/>
       <w:keepLines/>
-      <w:spacing w:after="0" w:before="40"/>
+      <w:spacing w:after="0" w:before="40" w:line="240" w:lineRule="auto"/>
       <w:outlineLvl w:val="6"/>
     </w:pPr>
     <w:rPr>
-      <w:rFonts w:cstheme="majorBidi" w:eastAsiaTheme="majorEastAsia"/>
+      <w:rFonts w:cstheme="majorBidi"/>
       <w:color w:themeColor="text1" w:themeTint="A6" w:val="595959"/>
     </w:rPr>
   </w:style>
@@ -615,11 +864,11 @@
     <w:pPr>
       <w:keepNext/>
       <w:keepLines/>
-      <w:spacing w:after="0"/>
+      <w:spacing w:after="0" w:line="240" w:lineRule="auto"/>
       <w:outlineLvl w:val="7"/>
     </w:pPr>
     <w:rPr>
-      <w:rFonts w:cstheme="majorBidi" w:eastAsiaTheme="majorEastAsia"/>
+      <w:rFonts w:cstheme="majorBidi"/>
       <w:i/>
       <w:iCs/>
       <w:color w:themeColor="text1" w:themeTint="D8" w:val="272727"/>
@@ -638,11 +887,11 @@
     <w:pPr>
       <w:keepNext/>
       <w:keepLines/>
-      <w:spacing w:after="0"/>
+      <w:spacing w:after="0" w:line="240" w:lineRule="auto"/>
       <w:outlineLvl w:val="8"/>
     </w:pPr>
     <w:rPr>
-      <w:rFonts w:cstheme="majorBidi" w:eastAsiaTheme="majorEastAsia"/>
+      <w:rFonts w:cstheme="majorBidi"/>
       <w:color w:themeColor="text1" w:themeTint="D8" w:val="272727"/>
     </w:rPr>
   </w:style>
@@ -653,7 +902,7 @@
     <w:uiPriority w:val="9"/>
     <w:rsid w:val="00A10FD9"/>
     <w:rPr>
-      <w:rFonts w:asciiTheme="majorHAnsi" w:cstheme="majorBidi" w:eastAsiaTheme="majorEastAsia" w:hAnsiTheme="majorHAnsi"/>
+      <w:rFonts w:cstheme="majorBidi"/>
       <w:color w:themeColor="accent1" w:themeShade="BF" w:val="0F4761"/>
       <w:sz w:val="40"/>
       <w:szCs w:val="40"/>
@@ -667,7 +916,7 @@
     <w:semiHidden/>
     <w:rsid w:val="00A10FD9"/>
     <w:rPr>
-      <w:rFonts w:asciiTheme="majorHAnsi" w:cstheme="majorBidi" w:eastAsiaTheme="majorEastAsia" w:hAnsiTheme="majorHAnsi"/>
+      <w:rFonts w:cstheme="majorBidi"/>
       <w:color w:themeColor="accent1" w:themeShade="BF" w:val="0F4761"/>
       <w:sz w:val="32"/>
       <w:szCs w:val="32"/>
@@ -681,7 +930,7 @@
     <w:semiHidden/>
     <w:rsid w:val="00A10FD9"/>
     <w:rPr>
-      <w:rFonts w:cstheme="majorBidi" w:eastAsiaTheme="majorEastAsia"/>
+      <w:rFonts w:cstheme="majorBidi"/>
       <w:color w:themeColor="accent1" w:themeShade="BF" w:val="0F4761"/>
       <w:sz w:val="28"/>
       <w:szCs w:val="28"/>
@@ -695,7 +944,7 @@
     <w:semiHidden/>
     <w:rsid w:val="00A10FD9"/>
     <w:rPr>
-      <w:rFonts w:cstheme="majorBidi" w:eastAsiaTheme="majorEastAsia"/>
+      <w:rFonts w:cstheme="majorBidi"/>
       <w:i/>
       <w:iCs/>
       <w:color w:themeColor="accent1" w:themeShade="BF" w:val="0F4761"/>
@@ -709,7 +958,7 @@
     <w:semiHidden/>
     <w:rsid w:val="00A10FD9"/>
     <w:rPr>
-      <w:rFonts w:cstheme="majorBidi" w:eastAsiaTheme="majorEastAsia"/>
+      <w:rFonts w:cstheme="majorBidi"/>
       <w:color w:themeColor="accent1" w:themeShade="BF" w:val="0F4761"/>
     </w:rPr>
   </w:style>
@@ -721,7 +970,7 @@
     <w:semiHidden/>
     <w:rsid w:val="00A10FD9"/>
     <w:rPr>
-      <w:rFonts w:cstheme="majorBidi" w:eastAsiaTheme="majorEastAsia"/>
+      <w:rFonts w:cstheme="majorBidi"/>
       <w:i/>
       <w:iCs/>
       <w:color w:themeColor="text1" w:themeTint="A6" w:val="595959"/>
@@ -735,7 +984,7 @@
     <w:semiHidden/>
     <w:rsid w:val="00A10FD9"/>
     <w:rPr>
-      <w:rFonts w:cstheme="majorBidi" w:eastAsiaTheme="majorEastAsia"/>
+      <w:rFonts w:cstheme="majorBidi"/>
       <w:color w:themeColor="text1" w:themeTint="A6" w:val="595959"/>
     </w:rPr>
   </w:style>
@@ -747,7 +996,7 @@
     <w:semiHidden/>
     <w:rsid w:val="00A10FD9"/>
     <w:rPr>
-      <w:rFonts w:cstheme="majorBidi" w:eastAsiaTheme="majorEastAsia"/>
+      <w:rFonts w:cstheme="majorBidi"/>
       <w:i/>
       <w:iCs/>
       <w:color w:themeColor="text1" w:themeTint="D8" w:val="272727"/>
@@ -761,7 +1010,7 @@
     <w:semiHidden/>
     <w:rsid w:val="00A10FD9"/>
     <w:rPr>
-      <w:rFonts w:cstheme="majorBidi" w:eastAsiaTheme="majorEastAsia"/>
+      <w:rFonts w:cstheme="majorBidi"/>
       <w:color w:themeColor="text1" w:themeTint="D8" w:val="272727"/>
     </w:rPr>
   </w:style>
@@ -773,7 +1022,7 @@
     <w:unhideWhenUsed/>
     <w:qFormat/>
     <w:pPr>
-      <w:spacing w:after="100" w:before="100"/>
+      <w:spacing w:after="100" w:before="100" w:line="240" w:lineRule="auto"/>
       <w:ind w:firstLine="0" w:left="480" w:right="480"/>
     </w:pPr>
   </w:style>
@@ -793,7 +1042,7 @@
     <w:unhideWhenUsed/>
     <w:qFormat/>
     <w:pPr>
-      <w:spacing w:after="100" w:before="100"/>
+      <w:spacing w:after="100" w:before="100" w:line="240" w:lineRule="auto"/>
       <w:ind w:firstLine="0" w:left="480" w:right="480"/>
     </w:pPr>
   </w:style>
@@ -833,7 +1082,7 @@
     <w:pPr>
       <w:keepNext/>
       <w:keepLines/>
-      <w:spacing w:after="0"/>
+      <w:spacing w:after="0" w:line="240" w:lineRule="auto"/>
     </w:pPr>
     <w:rPr>
       <w:b/>
@@ -848,7 +1097,7 @@
     <w:basedOn w:val="Normal"/>
     <w:link w:val="BodyTextChar"/>
     <w:pPr>
-      <w:spacing w:after="120" w:before="0"/>
+      <w:spacing w:after="120" w:before="0" w:line="240" w:lineRule="auto"/>
     </w:pPr>
     <w:rPr>
       <w:i/>
@@ -919,7 +1168,7 @@
       <w:outlineLvl w:val="9"/>
     </w:pPr>
     <w:rPr>
-      <w:rFonts w:asciiTheme="majorHAnsi" w:cstheme="majorBidi" w:eastAsiaTheme="majorEastAsia" w:hAnsiTheme="majorHAnsi"/>
+      <w:rFonts w:cstheme="majorBidi"/>
       <w:b w:val="0"/>
       <w:bCs w:val="0"/>
       <w:color w:themeColor="accent1" w:themeShade="BF" w:val="365F91"/>

</xml_diff>

<commit_message>
M&M resubmission: credit Durmaz et al. 2026b tile filtering, adopt Frank's AI-use wording, note editor's advice in cover letter
</commit_message>
<xml_diff>
--- a/paper/mam/cover_letter.docx
+++ b/paper/mam/cover_letter.docx
@@ -97,7 +97,7 @@
         <w:t xml:space="preserve"> </w:t>
       </w:r>
       <w:r>
-        <w:t xml:space="preserve">I agreed with that assessment. The earlier text had been condensed from a version written for a machine-learning venue, and it assumed a reader who already knew the methods. I have rewritten the paper from the beginning for a microscopist reader, and I want to be open that this is the same study.</w:t>
+        <w:t xml:space="preserve">I agreed with that assessment. The earlier text had been condensed from a version written for a machine-learning venue, and it assumed a reader who already knew the methods. I have rewritten the paper from the beginning for a microscopist reader, and I want to be open that this is the same study. When I asked on 25 September whether you would consider a rewritten version, you advised submitting it as a new submission, which I am doing here.</w:t>
       </w:r>
     </w:p>
     <w:p>
@@ -281,8 +281,6 @@
       <w:footnotePr>
         <w:numRestart w:val="eachSect"/>
       </w:footnotePr>
-      <w:pgSz w:w="12240" w:h="15840"/>
-      <w:pgMar w:top="1440" w:right="1440" w:bottom="1440" w:left="1440" w:header="720" w:footer="720" w:gutter="0"/>
     </w:sectPr>
   </w:body>
 </w:document>
@@ -515,7 +513,7 @@
   <w:docDefaults>
     <w:rPrDefault>
       <w:rPr>
-        <w:rFonts w:cstheme="minorBidi"/>
+        <w:rFonts w:asciiTheme="minorHAnsi" w:cstheme="minorBidi" w:eastAsiaTheme="minorEastAsia" w:hAnsiTheme="minorHAnsi"/>
         <w:sz w:val="24"/>
         <w:szCs w:val="24"/>
         <w:lang w:bidi="ar-SA" w:eastAsia="zh-CN" w:val="en-US"/>
@@ -523,7 +521,7 @@
     </w:rPrDefault>
     <w:pPrDefault>
       <w:pPr>
-        <w:spacing w:after="200" w:line="240" w:lineRule="auto"/>
+        <w:spacing w:after="200"/>
       </w:pPr>
     </w:pPrDefault>
   </w:docDefaults>
@@ -531,14 +529,6 @@
   <w:style w:default="1" w:styleId="Normal" w:type="paragraph">
     <w:name w:val="Normal"/>
     <w:qFormat/>
-    <w:pPr>
-      <w:spacing w:before="0" w:after="0" w:line="240" w:lineRule="auto"/>
-    </w:pPr>
-    <w:rPr>
-      <w:rFonts w:ascii="Times New Roman" w:hAnsi="Times New Roman" w:cs="Times New Roman"/>
-      <w:sz w:val="24"/>
-      <w:szCs w:val="24"/>
-    </w:rPr>
   </w:style>
   <w:style w:styleId="BodyText" w:type="paragraph">
     <w:name w:val="Body Text"/>
@@ -546,7 +536,7 @@
     <w:link w:val="BodyTextChar"/>
     <w:qFormat/>
     <w:pPr>
-      <w:spacing w:after="180" w:before="180" w:line="240" w:lineRule="auto"/>
+      <w:spacing w:after="180" w:before="180"/>
     </w:pPr>
   </w:style>
   <w:style w:customStyle="1" w:styleId="FirstParagraph" w:type="paragraph">
@@ -560,7 +550,7 @@
     <w:basedOn w:val="BodyText"/>
     <w:qFormat/>
     <w:pPr>
-      <w:spacing w:after="36" w:before="36" w:line="240" w:lineRule="auto"/>
+      <w:spacing w:after="36" w:before="36"/>
     </w:pPr>
   </w:style>
   <w:style w:styleId="Title" w:type="paragraph">
@@ -577,7 +567,7 @@
       <w:jc w:val="center"/>
     </w:pPr>
     <w:rPr>
-      <w:rFonts w:cstheme="majorBidi"/>
+      <w:rFonts w:asciiTheme="majorHAnsi" w:cstheme="majorBidi" w:eastAsiaTheme="majorEastAsia" w:hAnsiTheme="majorHAnsi"/>
       <w:sz w:val="56"/>
       <w:szCs w:val="56"/>
     </w:rPr>
@@ -589,7 +579,7 @@
     <w:uiPriority w:val="10"/>
     <w:rsid w:val="00A10FD9"/>
     <w:rPr>
-      <w:rFonts w:cstheme="majorBidi"/>
+      <w:rFonts w:asciiTheme="majorHAnsi" w:cstheme="majorBidi" w:eastAsiaTheme="majorEastAsia" w:hAnsiTheme="majorHAnsi"/>
       <w:sz w:val="56"/>
       <w:szCs w:val="56"/>
     </w:rPr>
@@ -608,8 +598,8 @@
       </w:numPr>
     </w:pPr>
     <w:rPr>
-      <w:rFonts w:cstheme="majorBidi"/>
-      <w:spacing w:val="15" w:line="240" w:lineRule="auto"/>
+      <w:rFonts w:cstheme="majorBidi" w:eastAsiaTheme="majorEastAsia"/>
+      <w:spacing w:val="15"/>
       <w:sz w:val="28"/>
       <w:szCs w:val="28"/>
     </w:rPr>
@@ -621,9 +611,9 @@
     <w:uiPriority w:val="11"/>
     <w:rsid w:val="00A10FD9"/>
     <w:rPr>
-      <w:rFonts w:cstheme="majorBidi"/>
+      <w:rFonts w:cstheme="majorBidi" w:eastAsiaTheme="majorEastAsia"/>
       <w:color w:themeColor="text1" w:themeTint="A6" w:val="595959"/>
-      <w:spacing w:val="15" w:line="240" w:lineRule="auto"/>
+      <w:spacing w:val="15"/>
       <w:sz w:val="28"/>
       <w:szCs w:val="28"/>
     </w:rPr>
@@ -664,7 +654,7 @@
     <w:pPr>
       <w:keepNext/>
       <w:keepLines/>
-      <w:spacing w:after="0" w:before="300" w:line="240" w:lineRule="auto"/>
+      <w:spacing w:after="0" w:before="300"/>
       <w:jc w:val="center"/>
     </w:pPr>
     <w:rPr>
@@ -681,7 +671,7 @@
     <w:pPr>
       <w:keepNext/>
       <w:keepLines/>
-      <w:spacing w:after="300" w:before="100" w:line="240" w:lineRule="auto"/>
+      <w:spacing w:after="300" w:before="100"/>
     </w:pPr>
     <w:rPr>
       <w:sz w:val="20"/>
@@ -707,11 +697,11 @@
     <w:pPr>
       <w:keepNext/>
       <w:keepLines/>
-      <w:spacing w:after="80" w:before="360" w:line="240" w:lineRule="auto"/>
+      <w:spacing w:after="80" w:before="360"/>
       <w:outlineLvl w:val="0"/>
     </w:pPr>
     <w:rPr>
-      <w:rFonts w:cstheme="majorBidi"/>
+      <w:rFonts w:asciiTheme="majorHAnsi" w:cstheme="majorBidi" w:eastAsiaTheme="majorEastAsia" w:hAnsiTheme="majorHAnsi"/>
       <w:color w:themeColor="accent1" w:themeShade="BF" w:val="0F4761"/>
       <w:sz w:val="40"/>
       <w:szCs w:val="40"/>
@@ -730,11 +720,11 @@
     <w:pPr>
       <w:keepNext/>
       <w:keepLines/>
-      <w:spacing w:after="80" w:before="160" w:line="240" w:lineRule="auto"/>
+      <w:spacing w:after="80" w:before="160"/>
       <w:outlineLvl w:val="1"/>
     </w:pPr>
     <w:rPr>
-      <w:rFonts w:cstheme="majorBidi"/>
+      <w:rFonts w:asciiTheme="majorHAnsi" w:cstheme="majorBidi" w:eastAsiaTheme="majorEastAsia" w:hAnsiTheme="majorHAnsi"/>
       <w:color w:themeColor="accent1" w:themeShade="BF" w:val="0F4761"/>
       <w:sz w:val="32"/>
       <w:szCs w:val="32"/>
@@ -753,11 +743,11 @@
     <w:pPr>
       <w:keepNext/>
       <w:keepLines/>
-      <w:spacing w:after="80" w:before="160" w:line="240" w:lineRule="auto"/>
+      <w:spacing w:after="80" w:before="160"/>
       <w:outlineLvl w:val="2"/>
     </w:pPr>
     <w:rPr>
-      <w:rFonts w:cstheme="majorBidi"/>
+      <w:rFonts w:cstheme="majorBidi" w:eastAsiaTheme="majorEastAsia"/>
       <w:color w:themeColor="accent1" w:themeShade="BF" w:val="0F4761"/>
       <w:sz w:val="28"/>
       <w:szCs w:val="28"/>
@@ -776,11 +766,11 @@
     <w:pPr>
       <w:keepNext/>
       <w:keepLines/>
-      <w:spacing w:after="40" w:before="80" w:line="240" w:lineRule="auto"/>
+      <w:spacing w:after="40" w:before="80"/>
       <w:outlineLvl w:val="3"/>
     </w:pPr>
     <w:rPr>
-      <w:rFonts w:cstheme="majorBidi"/>
+      <w:rFonts w:cstheme="majorBidi" w:eastAsiaTheme="majorEastAsia"/>
       <w:i/>
       <w:iCs/>
       <w:color w:themeColor="accent1" w:themeShade="BF" w:val="0F4761"/>
@@ -799,11 +789,11 @@
     <w:pPr>
       <w:keepNext/>
       <w:keepLines/>
-      <w:spacing w:after="40" w:before="80" w:line="240" w:lineRule="auto"/>
+      <w:spacing w:after="40" w:before="80"/>
       <w:outlineLvl w:val="4"/>
     </w:pPr>
     <w:rPr>
-      <w:rFonts w:cstheme="majorBidi"/>
+      <w:rFonts w:cstheme="majorBidi" w:eastAsiaTheme="majorEastAsia"/>
       <w:color w:themeColor="accent1" w:themeShade="BF" w:val="0F4761"/>
     </w:rPr>
   </w:style>
@@ -820,11 +810,11 @@
     <w:pPr>
       <w:keepNext/>
       <w:keepLines/>
-      <w:spacing w:after="0" w:before="40" w:line="240" w:lineRule="auto"/>
+      <w:spacing w:after="0" w:before="40"/>
       <w:outlineLvl w:val="5"/>
     </w:pPr>
     <w:rPr>
-      <w:rFonts w:cstheme="majorBidi"/>
+      <w:rFonts w:cstheme="majorBidi" w:eastAsiaTheme="majorEastAsia"/>
       <w:i/>
       <w:iCs/>
       <w:color w:themeColor="text1" w:themeTint="A6" w:val="595959"/>
@@ -843,11 +833,11 @@
     <w:pPr>
       <w:keepNext/>
       <w:keepLines/>
-      <w:spacing w:after="0" w:before="40" w:line="240" w:lineRule="auto"/>
+      <w:spacing w:after="0" w:before="40"/>
       <w:outlineLvl w:val="6"/>
     </w:pPr>
     <w:rPr>
-      <w:rFonts w:cstheme="majorBidi"/>
+      <w:rFonts w:cstheme="majorBidi" w:eastAsiaTheme="majorEastAsia"/>
       <w:color w:themeColor="text1" w:themeTint="A6" w:val="595959"/>
     </w:rPr>
   </w:style>
@@ -864,11 +854,11 @@
     <w:pPr>
       <w:keepNext/>
       <w:keepLines/>
-      <w:spacing w:after="0" w:line="240" w:lineRule="auto"/>
+      <w:spacing w:after="0"/>
       <w:outlineLvl w:val="7"/>
     </w:pPr>
     <w:rPr>
-      <w:rFonts w:cstheme="majorBidi"/>
+      <w:rFonts w:cstheme="majorBidi" w:eastAsiaTheme="majorEastAsia"/>
       <w:i/>
       <w:iCs/>
       <w:color w:themeColor="text1" w:themeTint="D8" w:val="272727"/>
@@ -887,11 +877,11 @@
     <w:pPr>
       <w:keepNext/>
       <w:keepLines/>
-      <w:spacing w:after="0" w:line="240" w:lineRule="auto"/>
+      <w:spacing w:after="0"/>
       <w:outlineLvl w:val="8"/>
     </w:pPr>
     <w:rPr>
-      <w:rFonts w:cstheme="majorBidi"/>
+      <w:rFonts w:cstheme="majorBidi" w:eastAsiaTheme="majorEastAsia"/>
       <w:color w:themeColor="text1" w:themeTint="D8" w:val="272727"/>
     </w:rPr>
   </w:style>
@@ -902,7 +892,7 @@
     <w:uiPriority w:val="9"/>
     <w:rsid w:val="00A10FD9"/>
     <w:rPr>
-      <w:rFonts w:cstheme="majorBidi"/>
+      <w:rFonts w:asciiTheme="majorHAnsi" w:cstheme="majorBidi" w:eastAsiaTheme="majorEastAsia" w:hAnsiTheme="majorHAnsi"/>
       <w:color w:themeColor="accent1" w:themeShade="BF" w:val="0F4761"/>
       <w:sz w:val="40"/>
       <w:szCs w:val="40"/>
@@ -916,7 +906,7 @@
     <w:semiHidden/>
     <w:rsid w:val="00A10FD9"/>
     <w:rPr>
-      <w:rFonts w:cstheme="majorBidi"/>
+      <w:rFonts w:asciiTheme="majorHAnsi" w:cstheme="majorBidi" w:eastAsiaTheme="majorEastAsia" w:hAnsiTheme="majorHAnsi"/>
       <w:color w:themeColor="accent1" w:themeShade="BF" w:val="0F4761"/>
       <w:sz w:val="32"/>
       <w:szCs w:val="32"/>
@@ -930,7 +920,7 @@
     <w:semiHidden/>
     <w:rsid w:val="00A10FD9"/>
     <w:rPr>
-      <w:rFonts w:cstheme="majorBidi"/>
+      <w:rFonts w:cstheme="majorBidi" w:eastAsiaTheme="majorEastAsia"/>
       <w:color w:themeColor="accent1" w:themeShade="BF" w:val="0F4761"/>
       <w:sz w:val="28"/>
       <w:szCs w:val="28"/>
@@ -944,7 +934,7 @@
     <w:semiHidden/>
     <w:rsid w:val="00A10FD9"/>
     <w:rPr>
-      <w:rFonts w:cstheme="majorBidi"/>
+      <w:rFonts w:cstheme="majorBidi" w:eastAsiaTheme="majorEastAsia"/>
       <w:i/>
       <w:iCs/>
       <w:color w:themeColor="accent1" w:themeShade="BF" w:val="0F4761"/>
@@ -958,7 +948,7 @@
     <w:semiHidden/>
     <w:rsid w:val="00A10FD9"/>
     <w:rPr>
-      <w:rFonts w:cstheme="majorBidi"/>
+      <w:rFonts w:cstheme="majorBidi" w:eastAsiaTheme="majorEastAsia"/>
       <w:color w:themeColor="accent1" w:themeShade="BF" w:val="0F4761"/>
     </w:rPr>
   </w:style>
@@ -970,7 +960,7 @@
     <w:semiHidden/>
     <w:rsid w:val="00A10FD9"/>
     <w:rPr>
-      <w:rFonts w:cstheme="majorBidi"/>
+      <w:rFonts w:cstheme="majorBidi" w:eastAsiaTheme="majorEastAsia"/>
       <w:i/>
       <w:iCs/>
       <w:color w:themeColor="text1" w:themeTint="A6" w:val="595959"/>
@@ -984,7 +974,7 @@
     <w:semiHidden/>
     <w:rsid w:val="00A10FD9"/>
     <w:rPr>
-      <w:rFonts w:cstheme="majorBidi"/>
+      <w:rFonts w:cstheme="majorBidi" w:eastAsiaTheme="majorEastAsia"/>
       <w:color w:themeColor="text1" w:themeTint="A6" w:val="595959"/>
     </w:rPr>
   </w:style>
@@ -996,7 +986,7 @@
     <w:semiHidden/>
     <w:rsid w:val="00A10FD9"/>
     <w:rPr>
-      <w:rFonts w:cstheme="majorBidi"/>
+      <w:rFonts w:cstheme="majorBidi" w:eastAsiaTheme="majorEastAsia"/>
       <w:i/>
       <w:iCs/>
       <w:color w:themeColor="text1" w:themeTint="D8" w:val="272727"/>
@@ -1010,7 +1000,7 @@
     <w:semiHidden/>
     <w:rsid w:val="00A10FD9"/>
     <w:rPr>
-      <w:rFonts w:cstheme="majorBidi"/>
+      <w:rFonts w:cstheme="majorBidi" w:eastAsiaTheme="majorEastAsia"/>
       <w:color w:themeColor="text1" w:themeTint="D8" w:val="272727"/>
     </w:rPr>
   </w:style>
@@ -1022,7 +1012,7 @@
     <w:unhideWhenUsed/>
     <w:qFormat/>
     <w:pPr>
-      <w:spacing w:after="100" w:before="100" w:line="240" w:lineRule="auto"/>
+      <w:spacing w:after="100" w:before="100"/>
       <w:ind w:firstLine="0" w:left="480" w:right="480"/>
     </w:pPr>
   </w:style>
@@ -1042,7 +1032,7 @@
     <w:unhideWhenUsed/>
     <w:qFormat/>
     <w:pPr>
-      <w:spacing w:after="100" w:before="100" w:line="240" w:lineRule="auto"/>
+      <w:spacing w:after="100" w:before="100"/>
       <w:ind w:firstLine="0" w:left="480" w:right="480"/>
     </w:pPr>
   </w:style>
@@ -1082,7 +1072,7 @@
     <w:pPr>
       <w:keepNext/>
       <w:keepLines/>
-      <w:spacing w:after="0" w:line="240" w:lineRule="auto"/>
+      <w:spacing w:after="0"/>
     </w:pPr>
     <w:rPr>
       <w:b/>
@@ -1097,7 +1087,7 @@
     <w:basedOn w:val="Normal"/>
     <w:link w:val="BodyTextChar"/>
     <w:pPr>
-      <w:spacing w:after="120" w:before="0" w:line="240" w:lineRule="auto"/>
+      <w:spacing w:after="120" w:before="0"/>
     </w:pPr>
     <w:rPr>
       <w:i/>
@@ -1168,7 +1158,7 @@
       <w:outlineLvl w:val="9"/>
     </w:pPr>
     <w:rPr>
-      <w:rFonts w:cstheme="majorBidi"/>
+      <w:rFonts w:asciiTheme="majorHAnsi" w:cstheme="majorBidi" w:eastAsiaTheme="majorEastAsia" w:hAnsiTheme="majorHAnsi"/>
       <w:b w:val="0"/>
       <w:bCs w:val="0"/>
       <w:color w:themeColor="accent1" w:themeShade="BF" w:val="365F91"/>

</xml_diff>

<commit_message>
Rebuild M&M figures as one image per file at 900 dpi after the office unsubmitted MAM-26-277; move in-image captions into the legends and remap panel references
</commit_message>
<xml_diff>
--- a/paper/mam/cover_letter.docx
+++ b/paper/mam/cover_letter.docx
@@ -233,6 +233,24 @@
         <w:pStyle w:val="BodyText"/>
       </w:pPr>
       <w:r>
+        <w:rPr>
+          <w:b/>
+          <w:bCs/>
+        </w:rPr>
+        <w:t xml:space="preserve">Figure files.</w:t>
+      </w:r>
+      <w:r>
+        <w:t xml:space="preserve"> </w:t>
+      </w:r>
+      <w:r>
+        <w:t xml:space="preserve">As the editorial office asked on 27 September, when it returned this submission (MAM-26-277) for its figures, each image is now supplied as its own file: 32 files for Figures 1 to 7, lettered in reading order. Every file is at least 2,550 pixels wide at 900 dpi, and all caption text has been moved into the figure legends. Figure 4E is coarse on purpose. It shows the narrow image’s region at the wide image’s own pixel size, enlarged without interpolation, and that coarseness is what the panel shows.</w:t>
+      </w:r>
+    </w:p>
+    <w:p>
+      <w:pPr>
+        <w:pStyle w:val="BodyText"/>
+      </w:pPr>
+      <w:r>
         <w:t xml:space="preserve">This work has not been published and is not under consideration elsewhere. The author declares no competing interests. The code, the per-pair result files and every analysis script are openly available, and the benchmark itself is public. The use of an artificial-intelligence assistant is described in Section 2.14.</w:t>
       </w:r>
     </w:p>
@@ -281,6 +299,8 @@
       <w:footnotePr>
         <w:numRestart w:val="eachSect"/>
       </w:footnotePr>
+      <w:pgSz w:w="12240" w:h="15840"/>
+      <w:pgMar w:top="1440" w:right="1440" w:bottom="1440" w:left="1440" w:header="720" w:footer="720" w:gutter="0"/>
     </w:sectPr>
   </w:body>
 </w:document>
@@ -513,7 +533,7 @@
   <w:docDefaults>
     <w:rPrDefault>
       <w:rPr>
-        <w:rFonts w:asciiTheme="minorHAnsi" w:cstheme="minorBidi" w:eastAsiaTheme="minorEastAsia" w:hAnsiTheme="minorHAnsi"/>
+        <w:rFonts w:cstheme="minorBidi"/>
         <w:sz w:val="24"/>
         <w:szCs w:val="24"/>
         <w:lang w:bidi="ar-SA" w:eastAsia="zh-CN" w:val="en-US"/>
@@ -521,7 +541,7 @@
     </w:rPrDefault>
     <w:pPrDefault>
       <w:pPr>
-        <w:spacing w:after="200"/>
+        <w:spacing w:after="200" w:line="240" w:lineRule="auto"/>
       </w:pPr>
     </w:pPrDefault>
   </w:docDefaults>
@@ -529,6 +549,14 @@
   <w:style w:default="1" w:styleId="Normal" w:type="paragraph">
     <w:name w:val="Normal"/>
     <w:qFormat/>
+    <w:pPr>
+      <w:spacing w:before="0" w:after="0" w:line="240" w:lineRule="auto"/>
+    </w:pPr>
+    <w:rPr>
+      <w:rFonts w:ascii="Times New Roman" w:hAnsi="Times New Roman" w:cs="Times New Roman"/>
+      <w:sz w:val="24"/>
+      <w:szCs w:val="24"/>
+    </w:rPr>
   </w:style>
   <w:style w:styleId="BodyText" w:type="paragraph">
     <w:name w:val="Body Text"/>
@@ -536,7 +564,7 @@
     <w:link w:val="BodyTextChar"/>
     <w:qFormat/>
     <w:pPr>
-      <w:spacing w:after="180" w:before="180"/>
+      <w:spacing w:after="180" w:before="180" w:line="240" w:lineRule="auto"/>
     </w:pPr>
   </w:style>
   <w:style w:customStyle="1" w:styleId="FirstParagraph" w:type="paragraph">
@@ -550,7 +578,7 @@
     <w:basedOn w:val="BodyText"/>
     <w:qFormat/>
     <w:pPr>
-      <w:spacing w:after="36" w:before="36"/>
+      <w:spacing w:after="36" w:before="36" w:line="240" w:lineRule="auto"/>
     </w:pPr>
   </w:style>
   <w:style w:styleId="Title" w:type="paragraph">
@@ -567,7 +595,7 @@
       <w:jc w:val="center"/>
     </w:pPr>
     <w:rPr>
-      <w:rFonts w:asciiTheme="majorHAnsi" w:cstheme="majorBidi" w:eastAsiaTheme="majorEastAsia" w:hAnsiTheme="majorHAnsi"/>
+      <w:rFonts w:cstheme="majorBidi"/>
       <w:sz w:val="56"/>
       <w:szCs w:val="56"/>
     </w:rPr>
@@ -579,7 +607,7 @@
     <w:uiPriority w:val="10"/>
     <w:rsid w:val="00A10FD9"/>
     <w:rPr>
-      <w:rFonts w:asciiTheme="majorHAnsi" w:cstheme="majorBidi" w:eastAsiaTheme="majorEastAsia" w:hAnsiTheme="majorHAnsi"/>
+      <w:rFonts w:cstheme="majorBidi"/>
       <w:sz w:val="56"/>
       <w:szCs w:val="56"/>
     </w:rPr>
@@ -598,8 +626,8 @@
       </w:numPr>
     </w:pPr>
     <w:rPr>
-      <w:rFonts w:cstheme="majorBidi" w:eastAsiaTheme="majorEastAsia"/>
-      <w:spacing w:val="15"/>
+      <w:rFonts w:cstheme="majorBidi"/>
+      <w:spacing w:val="15" w:line="240" w:lineRule="auto"/>
       <w:sz w:val="28"/>
       <w:szCs w:val="28"/>
     </w:rPr>
@@ -611,9 +639,9 @@
     <w:uiPriority w:val="11"/>
     <w:rsid w:val="00A10FD9"/>
     <w:rPr>
-      <w:rFonts w:cstheme="majorBidi" w:eastAsiaTheme="majorEastAsia"/>
+      <w:rFonts w:cstheme="majorBidi"/>
       <w:color w:themeColor="text1" w:themeTint="A6" w:val="595959"/>
-      <w:spacing w:val="15"/>
+      <w:spacing w:val="15" w:line="240" w:lineRule="auto"/>
       <w:sz w:val="28"/>
       <w:szCs w:val="28"/>
     </w:rPr>
@@ -654,7 +682,7 @@
     <w:pPr>
       <w:keepNext/>
       <w:keepLines/>
-      <w:spacing w:after="0" w:before="300"/>
+      <w:spacing w:after="0" w:before="300" w:line="240" w:lineRule="auto"/>
       <w:jc w:val="center"/>
     </w:pPr>
     <w:rPr>
@@ -671,7 +699,7 @@
     <w:pPr>
       <w:keepNext/>
       <w:keepLines/>
-      <w:spacing w:after="300" w:before="100"/>
+      <w:spacing w:after="300" w:before="100" w:line="240" w:lineRule="auto"/>
     </w:pPr>
     <w:rPr>
       <w:sz w:val="20"/>
@@ -697,11 +725,11 @@
     <w:pPr>
       <w:keepNext/>
       <w:keepLines/>
-      <w:spacing w:after="80" w:before="360"/>
+      <w:spacing w:after="80" w:before="360" w:line="240" w:lineRule="auto"/>
       <w:outlineLvl w:val="0"/>
     </w:pPr>
     <w:rPr>
-      <w:rFonts w:asciiTheme="majorHAnsi" w:cstheme="majorBidi" w:eastAsiaTheme="majorEastAsia" w:hAnsiTheme="majorHAnsi"/>
+      <w:rFonts w:cstheme="majorBidi"/>
       <w:color w:themeColor="accent1" w:themeShade="BF" w:val="0F4761"/>
       <w:sz w:val="40"/>
       <w:szCs w:val="40"/>
@@ -720,11 +748,11 @@
     <w:pPr>
       <w:keepNext/>
       <w:keepLines/>
-      <w:spacing w:after="80" w:before="160"/>
+      <w:spacing w:after="80" w:before="160" w:line="240" w:lineRule="auto"/>
       <w:outlineLvl w:val="1"/>
     </w:pPr>
     <w:rPr>
-      <w:rFonts w:asciiTheme="majorHAnsi" w:cstheme="majorBidi" w:eastAsiaTheme="majorEastAsia" w:hAnsiTheme="majorHAnsi"/>
+      <w:rFonts w:cstheme="majorBidi"/>
       <w:color w:themeColor="accent1" w:themeShade="BF" w:val="0F4761"/>
       <w:sz w:val="32"/>
       <w:szCs w:val="32"/>
@@ -743,11 +771,11 @@
     <w:pPr>
       <w:keepNext/>
       <w:keepLines/>
-      <w:spacing w:after="80" w:before="160"/>
+      <w:spacing w:after="80" w:before="160" w:line="240" w:lineRule="auto"/>
       <w:outlineLvl w:val="2"/>
     </w:pPr>
     <w:rPr>
-      <w:rFonts w:cstheme="majorBidi" w:eastAsiaTheme="majorEastAsia"/>
+      <w:rFonts w:cstheme="majorBidi"/>
       <w:color w:themeColor="accent1" w:themeShade="BF" w:val="0F4761"/>
       <w:sz w:val="28"/>
       <w:szCs w:val="28"/>
@@ -766,11 +794,11 @@
     <w:pPr>
       <w:keepNext/>
       <w:keepLines/>
-      <w:spacing w:after="40" w:before="80"/>
+      <w:spacing w:after="40" w:before="80" w:line="240" w:lineRule="auto"/>
       <w:outlineLvl w:val="3"/>
     </w:pPr>
     <w:rPr>
-      <w:rFonts w:cstheme="majorBidi" w:eastAsiaTheme="majorEastAsia"/>
+      <w:rFonts w:cstheme="majorBidi"/>
       <w:i/>
       <w:iCs/>
       <w:color w:themeColor="accent1" w:themeShade="BF" w:val="0F4761"/>
@@ -789,11 +817,11 @@
     <w:pPr>
       <w:keepNext/>
       <w:keepLines/>
-      <w:spacing w:after="40" w:before="80"/>
+      <w:spacing w:after="40" w:before="80" w:line="240" w:lineRule="auto"/>
       <w:outlineLvl w:val="4"/>
     </w:pPr>
     <w:rPr>
-      <w:rFonts w:cstheme="majorBidi" w:eastAsiaTheme="majorEastAsia"/>
+      <w:rFonts w:cstheme="majorBidi"/>
       <w:color w:themeColor="accent1" w:themeShade="BF" w:val="0F4761"/>
     </w:rPr>
   </w:style>
@@ -810,11 +838,11 @@
     <w:pPr>
       <w:keepNext/>
       <w:keepLines/>
-      <w:spacing w:after="0" w:before="40"/>
+      <w:spacing w:after="0" w:before="40" w:line="240" w:lineRule="auto"/>
       <w:outlineLvl w:val="5"/>
     </w:pPr>
     <w:rPr>
-      <w:rFonts w:cstheme="majorBidi" w:eastAsiaTheme="majorEastAsia"/>
+      <w:rFonts w:cstheme="majorBidi"/>
       <w:i/>
       <w:iCs/>
       <w:color w:themeColor="text1" w:themeTint="A6" w:val="595959"/>
@@ -833,11 +861,11 @@
     <w:pPr>
       <w:keepNext/>
       <w:keepLines/>
-      <w:spacing w:after="0" w:before="40"/>
+      <w:spacing w:after="0" w:before="40" w:line="240" w:lineRule="auto"/>
       <w:outlineLvl w:val="6"/>
     </w:pPr>
     <w:rPr>
-      <w:rFonts w:cstheme="majorBidi" w:eastAsiaTheme="majorEastAsia"/>
+      <w:rFonts w:cstheme="majorBidi"/>
       <w:color w:themeColor="text1" w:themeTint="A6" w:val="595959"/>
     </w:rPr>
   </w:style>
@@ -854,11 +882,11 @@
     <w:pPr>
       <w:keepNext/>
       <w:keepLines/>
-      <w:spacing w:after="0"/>
+      <w:spacing w:after="0" w:line="240" w:lineRule="auto"/>
       <w:outlineLvl w:val="7"/>
     </w:pPr>
     <w:rPr>
-      <w:rFonts w:cstheme="majorBidi" w:eastAsiaTheme="majorEastAsia"/>
+      <w:rFonts w:cstheme="majorBidi"/>
       <w:i/>
       <w:iCs/>
       <w:color w:themeColor="text1" w:themeTint="D8" w:val="272727"/>
@@ -877,11 +905,11 @@
     <w:pPr>
       <w:keepNext/>
       <w:keepLines/>
-      <w:spacing w:after="0"/>
+      <w:spacing w:after="0" w:line="240" w:lineRule="auto"/>
       <w:outlineLvl w:val="8"/>
     </w:pPr>
     <w:rPr>
-      <w:rFonts w:cstheme="majorBidi" w:eastAsiaTheme="majorEastAsia"/>
+      <w:rFonts w:cstheme="majorBidi"/>
       <w:color w:themeColor="text1" w:themeTint="D8" w:val="272727"/>
     </w:rPr>
   </w:style>
@@ -892,7 +920,7 @@
     <w:uiPriority w:val="9"/>
     <w:rsid w:val="00A10FD9"/>
     <w:rPr>
-      <w:rFonts w:asciiTheme="majorHAnsi" w:cstheme="majorBidi" w:eastAsiaTheme="majorEastAsia" w:hAnsiTheme="majorHAnsi"/>
+      <w:rFonts w:cstheme="majorBidi"/>
       <w:color w:themeColor="accent1" w:themeShade="BF" w:val="0F4761"/>
       <w:sz w:val="40"/>
       <w:szCs w:val="40"/>
@@ -906,7 +934,7 @@
     <w:semiHidden/>
     <w:rsid w:val="00A10FD9"/>
     <w:rPr>
-      <w:rFonts w:asciiTheme="majorHAnsi" w:cstheme="majorBidi" w:eastAsiaTheme="majorEastAsia" w:hAnsiTheme="majorHAnsi"/>
+      <w:rFonts w:cstheme="majorBidi"/>
       <w:color w:themeColor="accent1" w:themeShade="BF" w:val="0F4761"/>
       <w:sz w:val="32"/>
       <w:szCs w:val="32"/>
@@ -920,7 +948,7 @@
     <w:semiHidden/>
     <w:rsid w:val="00A10FD9"/>
     <w:rPr>
-      <w:rFonts w:cstheme="majorBidi" w:eastAsiaTheme="majorEastAsia"/>
+      <w:rFonts w:cstheme="majorBidi"/>
       <w:color w:themeColor="accent1" w:themeShade="BF" w:val="0F4761"/>
       <w:sz w:val="28"/>
       <w:szCs w:val="28"/>
@@ -934,7 +962,7 @@
     <w:semiHidden/>
     <w:rsid w:val="00A10FD9"/>
     <w:rPr>
-      <w:rFonts w:cstheme="majorBidi" w:eastAsiaTheme="majorEastAsia"/>
+      <w:rFonts w:cstheme="majorBidi"/>
       <w:i/>
       <w:iCs/>
       <w:color w:themeColor="accent1" w:themeShade="BF" w:val="0F4761"/>
@@ -948,7 +976,7 @@
     <w:semiHidden/>
     <w:rsid w:val="00A10FD9"/>
     <w:rPr>
-      <w:rFonts w:cstheme="majorBidi" w:eastAsiaTheme="majorEastAsia"/>
+      <w:rFonts w:cstheme="majorBidi"/>
       <w:color w:themeColor="accent1" w:themeShade="BF" w:val="0F4761"/>
     </w:rPr>
   </w:style>
@@ -960,7 +988,7 @@
     <w:semiHidden/>
     <w:rsid w:val="00A10FD9"/>
     <w:rPr>
-      <w:rFonts w:cstheme="majorBidi" w:eastAsiaTheme="majorEastAsia"/>
+      <w:rFonts w:cstheme="majorBidi"/>
       <w:i/>
       <w:iCs/>
       <w:color w:themeColor="text1" w:themeTint="A6" w:val="595959"/>
@@ -974,7 +1002,7 @@
     <w:semiHidden/>
     <w:rsid w:val="00A10FD9"/>
     <w:rPr>
-      <w:rFonts w:cstheme="majorBidi" w:eastAsiaTheme="majorEastAsia"/>
+      <w:rFonts w:cstheme="majorBidi"/>
       <w:color w:themeColor="text1" w:themeTint="A6" w:val="595959"/>
     </w:rPr>
   </w:style>
@@ -986,7 +1014,7 @@
     <w:semiHidden/>
     <w:rsid w:val="00A10FD9"/>
     <w:rPr>
-      <w:rFonts w:cstheme="majorBidi" w:eastAsiaTheme="majorEastAsia"/>
+      <w:rFonts w:cstheme="majorBidi"/>
       <w:i/>
       <w:iCs/>
       <w:color w:themeColor="text1" w:themeTint="D8" w:val="272727"/>
@@ -1000,7 +1028,7 @@
     <w:semiHidden/>
     <w:rsid w:val="00A10FD9"/>
     <w:rPr>
-      <w:rFonts w:cstheme="majorBidi" w:eastAsiaTheme="majorEastAsia"/>
+      <w:rFonts w:cstheme="majorBidi"/>
       <w:color w:themeColor="text1" w:themeTint="D8" w:val="272727"/>
     </w:rPr>
   </w:style>
@@ -1012,7 +1040,7 @@
     <w:unhideWhenUsed/>
     <w:qFormat/>
     <w:pPr>
-      <w:spacing w:after="100" w:before="100"/>
+      <w:spacing w:after="100" w:before="100" w:line="240" w:lineRule="auto"/>
       <w:ind w:firstLine="0" w:left="480" w:right="480"/>
     </w:pPr>
   </w:style>
@@ -1032,7 +1060,7 @@
     <w:unhideWhenUsed/>
     <w:qFormat/>
     <w:pPr>
-      <w:spacing w:after="100" w:before="100"/>
+      <w:spacing w:after="100" w:before="100" w:line="240" w:lineRule="auto"/>
       <w:ind w:firstLine="0" w:left="480" w:right="480"/>
     </w:pPr>
   </w:style>
@@ -1072,7 +1100,7 @@
     <w:pPr>
       <w:keepNext/>
       <w:keepLines/>
-      <w:spacing w:after="0"/>
+      <w:spacing w:after="0" w:line="240" w:lineRule="auto"/>
     </w:pPr>
     <w:rPr>
       <w:b/>
@@ -1087,7 +1115,7 @@
     <w:basedOn w:val="Normal"/>
     <w:link w:val="BodyTextChar"/>
     <w:pPr>
-      <w:spacing w:after="120" w:before="0"/>
+      <w:spacing w:after="120" w:before="0" w:line="240" w:lineRule="auto"/>
     </w:pPr>
     <w:rPr>
       <w:i/>
@@ -1158,7 +1186,7 @@
       <w:outlineLvl w:val="9"/>
     </w:pPr>
     <w:rPr>
-      <w:rFonts w:asciiTheme="majorHAnsi" w:cstheme="majorBidi" w:eastAsiaTheme="majorEastAsia" w:hAnsiTheme="majorHAnsi"/>
+      <w:rFonts w:cstheme="majorBidi"/>
       <w:b w:val="0"/>
       <w:bCs w:val="0"/>
       <w:color w:themeColor="accent1" w:themeShade="BF" w:val="365F91"/>

</xml_diff>